<commit_message>
docs(proposal): update and revise client proposal documentation
</commit_message>
<xml_diff>
--- a/docs/client-proposal-and-requirements.docx
+++ b/docs/client-proposal-and-requirements.docx
@@ -3647,6 +3647,49 @@
         <w:pStyle w:val="Heading1"/>
       </w:pPr>
       <w:r>
+        <w:t>Project Payment Terms Revised 16 October 2026</w:t>
+      </w:r>
+    </w:p>
+    <w:p>
+      <w:r>
+        <w:t>All amounts are in Philippine pesos (PHP).</w:t>
+      </w:r>
+    </w:p>
+    <w:p>
+      <w:r>
+        <w:t>Down payment: PHP 15,000, one-time upon project agreement.</w:t>
+      </w:r>
+    </w:p>
+    <w:p>
+      <w:r>
+        <w:t>Monthly project payment: PHP 5,000. First due date and payment duration to be agreed in writing.</w:t>
+      </w:r>
+    </w:p>
+    <w:p>
+      <w:r>
+        <w:t>Claude Code development tooling budget: PHP 1,200 per month during development only, separate from the project payment, to help speed up development, especially the tablet kiosk Progressive Web App (PWA). This is the project tooling budget, not a guarantee of provider subscription pricing or a delivery timeline. It ends when development is complete unless extended by written agreement.</w:t>
+      </w:r>
+    </w:p>
+    <w:p>
+      <w:r>
+        <w:t>Monthly total during development: PHP 6,200, excluding the one-time down payment and direct hosting, domain, and messaging costs.</w:t>
+      </w:r>
+    </w:p>
+    <w:p>
+      <w:r>
+        <w:t>Before signing, agree in writing on the number of monthly project payments, billing due dates, total project price, and treatment of the down payment toward that total. No fixed term or final balance is established here.</w:t>
+      </w:r>
+    </w:p>
+    <w:p>
+      <w:r>
+        <w:t>Post-handover maintenance fees and support scope require a separate written agreement. No additional maintenance fee is established here. Confirm kiosk PWA scope and delivery timing within the agreed milestones.</w:t>
+      </w:r>
+    </w:p>
+    <w:p>
+      <w:pPr>
+        <w:pStyle w:val="Heading1"/>
+      </w:pPr>
+      <w:r>
         <w:t>12 Acceptance</w:t>
       </w:r>
     </w:p>

</xml_diff>